<commit_message>
updated the doc file-1
</commit_message>
<xml_diff>
--- a/crosscomp/final_report.docx
+++ b/crosscomp/final_report.docx
@@ -212,6 +212,14 @@
     </w:p>
     <w:p>
       <w:pPr>
+        <w:rPr>
+          <w:rFonts w:ascii="Helvetica Neue" w:hAnsi="Helvetica Neue"/>
+          <w:color w:val="000000" w:themeColor="text1"/>
+        </w:rPr>
+      </w:pPr>
+    </w:p>
+    <w:p>
+      <w:pPr>
         <w:pStyle w:val="Heading2"/>
         <w:rPr>
           <w:rFonts w:ascii="Helvetica Neue" w:hAnsi="Helvetica Neue"/>
@@ -304,6 +312,14 @@
     </w:p>
     <w:p>
       <w:pPr>
+        <w:rPr>
+          <w:rFonts w:ascii="Helvetica Neue" w:hAnsi="Helvetica Neue"/>
+          <w:color w:val="000000" w:themeColor="text1"/>
+        </w:rPr>
+      </w:pPr>
+    </w:p>
+    <w:p>
+      <w:pPr>
         <w:pStyle w:val="Heading2"/>
         <w:rPr>
           <w:rFonts w:ascii="Helvetica Neue" w:hAnsi="Helvetica Neue"/>
@@ -360,7 +376,15 @@
           <w:rFonts w:ascii="Helvetica Neue" w:hAnsi="Helvetica Neue"/>
           <w:color w:val="000000" w:themeColor="text1"/>
         </w:rPr>
-        <w:t xml:space="preserve">, and Park, Jang, and Ko (2024) evaluate exclusive AV lanes purely by the automation share needed to maximize network efficiency. The Equity thread (Shashi &amp; Aditya) documents the same reduction applied to equity itself: Cha et al. (2020) solve transit-stop placement as a pure spatial coverage problem with, by the authors' own account, no role for transport-disadvantaged residents in defining need, and Chen et al. (2025) model infrastructure-investment equity with a </w:t>
+        <w:t xml:space="preserve">, and Park, Jang, and Ko (2024) evaluate exclusive AV lanes purely by the automation share needed to maximize network efficiency. The Equity thread (Shashi &amp; Aditya) documents the same reduction applied to equity itself: Cha et al. (2020) solve transit-stop placement as a pure spatial </w:t>
+      </w:r>
+      <w:r>
+        <w:rPr>
+          <w:rFonts w:ascii="Helvetica Neue" w:hAnsi="Helvetica Neue"/>
+          <w:color w:val="000000" w:themeColor="text1"/>
+        </w:rPr>
+        <w:lastRenderedPageBreak/>
+        <w:t xml:space="preserve">coverage problem with, by the authors' own account, no role for transport-disadvantaged residents in defining need, and Chen et al. (2025) model infrastructure-investment equity with a </w:t>
       </w:r>
       <w:r>
         <w:rPr>
@@ -368,16 +392,7 @@
           <w:color w:val="000000" w:themeColor="text1"/>
           <w:highlight w:val="yellow"/>
         </w:rPr>
-        <w:t xml:space="preserve">deep-learning allocation formula the authors themselves say </w:t>
-      </w:r>
-      <w:r>
-        <w:rPr>
-          <w:rFonts w:ascii="Helvetica Neue" w:hAnsi="Helvetica Neue"/>
-          <w:color w:val="000000" w:themeColor="text1"/>
-          <w:highlight w:val="yellow"/>
-        </w:rPr>
-        <w:lastRenderedPageBreak/>
-        <w:t>lacks the community engagement needed to capture residents' actual perspectives.</w:t>
+        <w:t>deep-learning allocation formula the authors themselves say lacks the community engagement needed to capture residents' actual perspectives.</w:t>
       </w:r>
       <w:r>
         <w:rPr>
@@ -401,6 +416,14 @@
         </w:rPr>
         <w:t>, discovered only once citizens were given room to define the problem themselves. This supports clause 3 and clause 5 most sharply because it shows the same optimization logic applied unreflectively even inside research explicitly framed around equity.</w:t>
       </w:r>
+    </w:p>
+    <w:p>
+      <w:pPr>
+        <w:rPr>
+          <w:rFonts w:ascii="Helvetica Neue" w:hAnsi="Helvetica Neue"/>
+          <w:color w:val="000000" w:themeColor="text1"/>
+        </w:rPr>
+      </w:pPr>
     </w:p>
     <w:p>
       <w:pPr>
@@ -510,6 +533,14 @@
     </w:p>
     <w:p>
       <w:pPr>
+        <w:rPr>
+          <w:rFonts w:ascii="Helvetica Neue" w:hAnsi="Helvetica Neue"/>
+          <w:color w:val="000000" w:themeColor="text1"/>
+        </w:rPr>
+      </w:pPr>
+    </w:p>
+    <w:p>
+      <w:pPr>
         <w:pStyle w:val="Heading2"/>
         <w:rPr>
           <w:rFonts w:ascii="Helvetica Neue" w:hAnsi="Helvetica Neue"/>
@@ -551,7 +582,15 @@
           <w:rFonts w:ascii="Helvetica Neue" w:hAnsi="Helvetica Neue"/>
           <w:color w:val="000000" w:themeColor="text1"/>
         </w:rPr>
-        <w:t xml:space="preserve"> The Equity thread (Shashi &amp; Aditya) shows the same dynamic inside a real planning process: Klaever et al. (2025) find Berlin residents' withdrawal from official participatory venues, following experiences like public humiliation by a mayor, revealed exactly the trust deficit the process claimed to fix, while Agrawaal et al. (2024) find Canadian advocates </w:t>
+        <w:t xml:space="preserve"> The Equity thread (Shashi &amp; Aditya) shows the same </w:t>
+      </w:r>
+      <w:r>
+        <w:rPr>
+          <w:rFonts w:ascii="Helvetica Neue" w:hAnsi="Helvetica Neue"/>
+          <w:color w:val="000000" w:themeColor="text1"/>
+        </w:rPr>
+        <w:lastRenderedPageBreak/>
+        <w:t xml:space="preserve">dynamic inside a real planning process: Klaever et al. (2025) find Berlin residents' withdrawal from official participatory venues, following experiences like public humiliation by a mayor, revealed exactly the trust deficit the process claimed to fix, while Agrawaal et al. (2024) find Canadian advocates </w:t>
       </w:r>
       <w:r>
         <w:rPr>
@@ -566,16 +605,32 @@
           <w:rFonts w:ascii="Helvetica Neue" w:hAnsi="Helvetica Neue"/>
           <w:color w:val="000000" w:themeColor="text1"/>
         </w:rPr>
-        <w:t xml:space="preserve"> The Engineering/Safety thread (Amy &amp; Saanvi) offers a mirror image: Nordhoff, Stapel, van Arem, and Happee (2020) describe pedestrians and </w:t>
+        <w:t xml:space="preserve"> The Engineering/Safety thread (Amy &amp; Saanvi) offers a mirror image: Nordhoff, Stapel, van Arem, and Happee (2020) describe pedestrians and cyclists “testing” an automated shuttle, stepping in front of it or pressing its emergency button, and find the field's response is to read this as distrust or a problem to manage, up to flagging non-compliant road users to police, rather than as informative signal. Together </w:t>
       </w:r>
+      <w:proofErr w:type="gramStart"/>
       <w:r>
         <w:rPr>
           <w:rFonts w:ascii="Helvetica Neue" w:hAnsi="Helvetica Neue"/>
           <w:color w:val="000000" w:themeColor="text1"/>
         </w:rPr>
-        <w:lastRenderedPageBreak/>
-        <w:t>cyclists “testing” an automated shuttle, stepping in front of it or pressing its emergency button, and find the field's response is to read this as distrust or a problem to manage, up to flagging non-compliant road users to police, rather than as informative signal. Together these support clause 4 and clause 5: the same friction one thread treats as the richest available data about community values, another treats as noise to engineer away.</w:t>
+        <w:t>these support clause</w:t>
       </w:r>
+      <w:proofErr w:type="gramEnd"/>
+      <w:r>
+        <w:rPr>
+          <w:rFonts w:ascii="Helvetica Neue" w:hAnsi="Helvetica Neue"/>
+          <w:color w:val="000000" w:themeColor="text1"/>
+        </w:rPr>
+        <w:t xml:space="preserve"> 4 and clause 5: the same friction one thread treats as the richest available data about community values, another treats as noise to engineer away.</w:t>
+      </w:r>
+    </w:p>
+    <w:p>
+      <w:pPr>
+        <w:rPr>
+          <w:rFonts w:ascii="Helvetica Neue" w:hAnsi="Helvetica Neue"/>
+          <w:color w:val="000000" w:themeColor="text1"/>
+        </w:rPr>
+      </w:pPr>
     </w:p>
     <w:p>
       <w:pPr>
@@ -748,12 +803,20 @@
           <w:color w:val="000000" w:themeColor="text1"/>
         </w:rPr>
       </w:pPr>
+    </w:p>
+    <w:p>
+      <w:pPr>
+        <w:pStyle w:val="Heading2"/>
+        <w:rPr>
+          <w:rFonts w:ascii="Helvetica Neue" w:hAnsi="Helvetica Neue"/>
+          <w:color w:val="000000" w:themeColor="text1"/>
+        </w:rPr>
+      </w:pPr>
       <w:r>
         <w:rPr>
           <w:rFonts w:ascii="Helvetica Neue" w:hAnsi="Helvetica Neue"/>
           <w:color w:val="000000" w:themeColor="text1"/>
         </w:rPr>
-        <w:lastRenderedPageBreak/>
         <w:t>Cross-thread mechanism heatmap</w:t>
       </w:r>
     </w:p>
@@ -772,7 +835,7 @@
           <w:color w:val="000000" w:themeColor="text1"/>
         </w:rPr>
         <w:drawing>
-          <wp:inline distT="0" distB="0" distL="0" distR="0" wp14:anchorId="5BF0F4E8" wp14:editId="45F0500F">
+          <wp:inline distT="0" distB="0" distL="0" distR="0" wp14:anchorId="5BF0F4E8" wp14:editId="4BAA6C4B">
             <wp:extent cx="5303520" cy="3449777"/>
             <wp:effectExtent l="0" t="0" r="0" b="0"/>
             <wp:docPr id="2" name="Picture 2"/>
@@ -813,7 +876,9 @@
         <w:jc w:val="center"/>
         <w:rPr>
           <w:rFonts w:ascii="Helvetica Neue" w:hAnsi="Helvetica Neue"/>
+          <w:i/>
           <w:color w:val="000000" w:themeColor="text1"/>
+          <w:sz w:val="19"/>
         </w:rPr>
       </w:pPr>
       <w:r>
@@ -823,8 +888,37 @@
           <w:color w:val="000000" w:themeColor="text1"/>
           <w:sz w:val="19"/>
         </w:rPr>
-        <w:t>Count of papers per mechanism per thread. The top four mechanisms are populated in all three threads (genuinely cross-cutting); the bottom mechanism, community-led alternatives, is Equity- and Participatory-only, with zero Engineering/Safety support.</w:t>
+        <w:t xml:space="preserve">Count of papers per mechanism per thread. The top four mechanisms are populated in all three threads (genuinely </w:t>
       </w:r>
+      <w:proofErr w:type="gramStart"/>
+      <w:r>
+        <w:rPr>
+          <w:rFonts w:ascii="Helvetica Neue" w:hAnsi="Helvetica Neue"/>
+          <w:i/>
+          <w:color w:val="000000" w:themeColor="text1"/>
+          <w:sz w:val="19"/>
+        </w:rPr>
+        <w:t>cross-cutting</w:t>
+      </w:r>
+      <w:proofErr w:type="gramEnd"/>
+      <w:r>
+        <w:rPr>
+          <w:rFonts w:ascii="Helvetica Neue" w:hAnsi="Helvetica Neue"/>
+          <w:i/>
+          <w:color w:val="000000" w:themeColor="text1"/>
+          <w:sz w:val="19"/>
+        </w:rPr>
+        <w:t>); the bottom mechanism, community-led alternatives, is Equity- and Participatory-only, with zero Engineering/Safety support.</w:t>
+      </w:r>
+    </w:p>
+    <w:p>
+      <w:pPr>
+        <w:jc w:val="center"/>
+        <w:rPr>
+          <w:rFonts w:ascii="Helvetica Neue" w:hAnsi="Helvetica Neue"/>
+          <w:color w:val="000000" w:themeColor="text1"/>
+        </w:rPr>
+      </w:pPr>
     </w:p>
     <w:p>
       <w:pPr>
@@ -839,6 +933,7 @@
           <w:rFonts w:ascii="Helvetica Neue" w:hAnsi="Helvetica Neue"/>
           <w:color w:val="000000" w:themeColor="text1"/>
         </w:rPr>
+        <w:lastRenderedPageBreak/>
         <w:t>Who is centered, by thread</w:t>
       </w:r>
     </w:p>
@@ -898,7 +993,9 @@
         <w:jc w:val="center"/>
         <w:rPr>
           <w:rFonts w:ascii="Helvetica Neue" w:hAnsi="Helvetica Neue"/>
+          <w:i/>
           <w:color w:val="000000" w:themeColor="text1"/>
+          <w:sz w:val="19"/>
         </w:rPr>
       </w:pPr>
       <w:r>
@@ -908,9 +1005,17 @@
           <w:color w:val="000000" w:themeColor="text1"/>
           <w:sz w:val="19"/>
         </w:rPr>
-        <w:lastRenderedPageBreak/>
         <w:t>Engineering/Safety centers engineers, regulators, and researchers exclusively (0% community members). Equity centers community members and advocates in 61% of its papers. Participatory Method centers community members and frontline practitioners in 54%. Participatory Method has no Who-is-centered column; its buckets are inferred from Central claim and Relevance to argument text and flagged as such.</w:t>
       </w:r>
+    </w:p>
+    <w:p>
+      <w:pPr>
+        <w:jc w:val="center"/>
+        <w:rPr>
+          <w:rFonts w:ascii="Helvetica Neue" w:hAnsi="Helvetica Neue"/>
+          <w:color w:val="000000" w:themeColor="text1"/>
+        </w:rPr>
+      </w:pPr>
     </w:p>
     <w:p>
       <w:pPr>
@@ -995,21 +1100,6 @@
           <w:sz w:val="19"/>
         </w:rPr>
         <w:t>Optional. Equity is the oldest and most continuous body of evidence (2010 to 2026); Engineering/Safety and Participatory Method are both concentrated in the last 8 years.</w:t>
-      </w:r>
-    </w:p>
-    <w:p>
-      <w:pPr>
-        <w:rPr>
-          <w:rFonts w:ascii="Helvetica Neue" w:hAnsi="Helvetica Neue"/>
-          <w:color w:val="000000" w:themeColor="text1"/>
-        </w:rPr>
-      </w:pPr>
-      <w:r>
-        <w:rPr>
-          <w:rFonts w:ascii="Helvetica Neue" w:hAnsi="Helvetica Neue"/>
-          <w:color w:val="000000" w:themeColor="text1"/>
-        </w:rPr>
-        <w:br w:type="page"/>
       </w:r>
     </w:p>
     <w:p>
@@ -1823,28 +1913,27 @@
           <w:color w:val="000000" w:themeColor="text1"/>
         </w:rPr>
       </w:pPr>
-      <w:r>
-        <w:rPr>
-          <w:rFonts w:ascii="Helvetica Neue" w:hAnsi="Helvetica Neue"/>
-          <w:color w:val="000000" w:themeColor="text1"/>
-        </w:rPr>
-        <w:br w:type="page"/>
-      </w:r>
     </w:p>
     <w:p>
       <w:pPr>
-        <w:pStyle w:val="Heading1"/>
         <w:rPr>
           <w:rFonts w:ascii="Helvetica Neue" w:hAnsi="Helvetica Neue"/>
+          <w:b/>
+          <w:bCs/>
           <w:color w:val="000000" w:themeColor="text1"/>
+          <w:sz w:val="28"/>
+          <w:szCs w:val="28"/>
         </w:rPr>
       </w:pPr>
       <w:r>
         <w:rPr>
           <w:rFonts w:ascii="Helvetica Neue" w:hAnsi="Helvetica Neue"/>
+          <w:b/>
+          <w:bCs/>
           <w:color w:val="000000" w:themeColor="text1"/>
+          <w:sz w:val="28"/>
+          <w:szCs w:val="28"/>
         </w:rPr>
-        <w:lastRenderedPageBreak/>
         <w:t>Gaps</w:t>
       </w:r>
     </w:p>
@@ -1938,7 +2027,7 @@
           <w:rFonts w:ascii="Helvetica Neue" w:hAnsi="Helvetica Neue"/>
           <w:color w:val="000000" w:themeColor="text1"/>
         </w:rPr>
-        <w:t>The Food Justice thread (Joy, Crystal) was skipped this pass at the user's request. Given the paper's case study is set in a food pantry, re-running Steps 1 through 6 once that tracker is available is likely to change both the mechanism list and the clause 4 and clause 7 numbers more than any other single addition would.</w:t>
+        <w:t>The Food Justice thread (Joy, Crystal) was skipped this pass. Given the paper's case study is set in a food pantry, re-running is likely to change both the mechanism list and the clause 4 and clause 7 numbers more than any other single addition would.</w:t>
       </w:r>
     </w:p>
     <w:sectPr>

</xml_diff>